<commit_message>
Resume: IT Analyst Applications - Vulnerability Management Analyst @ Caterpillar Inc. (MNC)
</commit_message>
<xml_diff>
--- a/resumes/Resume_IT_Analyst_Applications_-_Vulnerabi_Caterpillar_Inc___MNC_.docx
+++ b/resumes/Resume_IT_Analyst_Applications_-_Vulnerabi_Caterpillar_Inc___MNC_.docx
@@ -117,7 +117,7 @@
         <w:pBdr>
           <w:bottom w:val="single" w:sz="6" w:space="1" w:color="000000"/>
         </w:pBdr>
-        <w:spacing w:before="116" w:after="0"/>
+        <w:spacing w:before="173" w:after="0"/>
       </w:pPr>
       <w:r>
         <w:rPr>
@@ -289,7 +289,7 @@
     </w:p>
     <w:p>
       <w:pPr>
-        <w:spacing w:before="20" w:after="20"/>
+        <w:spacing w:before="32" w:after="32"/>
       </w:pPr>
     </w:p>
     <w:p>
@@ -297,7 +297,7 @@
         <w:pBdr>
           <w:bottom w:val="single" w:sz="6" w:space="1" w:color="000000"/>
         </w:pBdr>
-        <w:spacing w:before="116" w:after="0"/>
+        <w:spacing w:before="173" w:after="0"/>
       </w:pPr>
       <w:r>
         <w:rPr>
@@ -404,16 +404,16 @@
           <w:ilvl w:val="0"/>
           <w:numId w:val="2"/>
         </w:numPr>
-        <w:spacing w:before="13" w:after="33"/>
-      </w:pPr>
-      <w:r>
-        <w:rPr>
-          <w:rFonts w:ascii="Source Sans Pro" w:eastAsia="Source Sans Pro" w:hAnsi="Source Sans Pro" w:cs="Source Sans Pro"/>
-          <w:color w:val="000000"/>
-          <w:sz w:val="19"/>
-          <w:szCs w:val="19"/>
-        </w:rPr>
-        <w:t>Triaged 50+ weekly inventory reimbursement cases by severity and policy eligibility, leveraging ITIL and IT Service Management principles.</w:t>
+        <w:spacing w:before="13" w:after="48"/>
+      </w:pPr>
+      <w:r>
+        <w:rPr>
+          <w:rFonts w:ascii="Source Sans Pro" w:eastAsia="Source Sans Pro" w:hAnsi="Source Sans Pro" w:cs="Source Sans Pro"/>
+          <w:color w:val="000000"/>
+          <w:sz w:val="19"/>
+          <w:szCs w:val="19"/>
+        </w:rPr>
+        <w:t>Triaged 50+ weekly cases by severity and policy eligibility, applying structured case review and escalation decisions to inform IT Security risk management.</w:t>
       </w:r>
     </w:p>
     <w:p>
@@ -423,16 +423,16 @@
           <w:ilvl w:val="0"/>
           <w:numId w:val="2"/>
         </w:numPr>
-        <w:spacing w:before="13" w:after="33"/>
-      </w:pPr>
-      <w:r>
-        <w:rPr>
-          <w:rFonts w:ascii="Source Sans Pro" w:eastAsia="Source Sans Pro" w:hAnsi="Source Sans Pro" w:cs="Source Sans Pro"/>
-          <w:color w:val="000000"/>
-          <w:sz w:val="19"/>
-          <w:szCs w:val="19"/>
-        </w:rPr>
-        <w:t>Performed root cause analysis on seller claims to identify policy violations and anomalous patterns, demonstrating investigative instincts central to Risk Management and Compliance.</w:t>
+        <w:spacing w:before="13" w:after="48"/>
+      </w:pPr>
+      <w:r>
+        <w:rPr>
+          <w:rFonts w:ascii="Source Sans Pro" w:eastAsia="Source Sans Pro" w:hAnsi="Source Sans Pro" w:cs="Source Sans Pro"/>
+          <w:color w:val="000000"/>
+          <w:sz w:val="19"/>
+          <w:szCs w:val="19"/>
+        </w:rPr>
+        <w:t>Investigated policy exceptions to identify root causes, risk impact, and corrective actions.</w:t>
       </w:r>
     </w:p>
     <w:p>
@@ -442,16 +442,16 @@
           <w:ilvl w:val="0"/>
           <w:numId w:val="2"/>
         </w:numPr>
-        <w:spacing w:before="13" w:after="33"/>
-      </w:pPr>
-      <w:r>
-        <w:rPr>
-          <w:rFonts w:ascii="Source Sans Pro" w:eastAsia="Source Sans Pro" w:hAnsi="Source Sans Pro" w:cs="Source Sans Pro"/>
-          <w:color w:val="000000"/>
-          <w:sz w:val="19"/>
-          <w:szCs w:val="19"/>
-        </w:rPr>
-        <w:t>Maintained audit-ready case documentation recording investigation findings, decisions, and corrective actions, establishing the evidence chain-of-custody discipline required for IT Security and ITIL.</w:t>
+        <w:spacing w:before="13" w:after="48"/>
+      </w:pPr>
+      <w:r>
+        <w:rPr>
+          <w:rFonts w:ascii="Source Sans Pro" w:eastAsia="Source Sans Pro" w:hAnsi="Source Sans Pro" w:cs="Source Sans Pro"/>
+          <w:color w:val="000000"/>
+          <w:sz w:val="19"/>
+          <w:szCs w:val="19"/>
+        </w:rPr>
+        <w:t>Triaged 50+ weekly cases by severity, supporting prioritization of high-risk exceptions.</w:t>
       </w:r>
     </w:p>
     <w:p>
@@ -461,47 +461,47 @@
           <w:ilvl w:val="0"/>
           <w:numId w:val="2"/>
         </w:numPr>
-        <w:spacing w:before="13" w:after="33"/>
-      </w:pPr>
-      <w:r>
-        <w:rPr>
-          <w:rFonts w:ascii="Source Sans Pro" w:eastAsia="Source Sans Pro" w:hAnsi="Source Sans Pro" w:cs="Source Sans Pro"/>
-          <w:color w:val="000000"/>
-          <w:sz w:val="19"/>
-          <w:szCs w:val="19"/>
-        </w:rPr>
-        <w:t>[[AMZ_B</w:t>
-      </w:r>
-      <w:r>
-        <w:rPr>
-          <w:rFonts w:ascii="Source Sans Pro" w:eastAsia="Source Sans Pro" w:hAnsi="Source Sans Pro" w:cs="Source Sans Pro"/>
-          <w:color w:val="000000"/>
-          <w:sz w:val="19"/>
-          <w:szCs w:val="19"/>
-        </w:rPr>
-        <w:t>4</w:t>
-      </w:r>
-      <w:r>
-        <w:rPr>
-          <w:rFonts w:ascii="Source Sans Pro" w:eastAsia="Source Sans Pro" w:hAnsi="Source Sans Pro" w:cs="Source Sans Pro"/>
-          <w:color w:val="000000"/>
-          <w:sz w:val="19"/>
-          <w:szCs w:val="19"/>
-        </w:rPr>
-        <w:t>]]</w:t>
+        <w:spacing w:before="13" w:after="48"/>
+      </w:pPr>
+      <w:r>
+        <w:rPr>
+          <w:rFonts w:ascii="Source Sans Pro" w:eastAsia="Source Sans Pro" w:hAnsi="Source Sans Pro" w:cs="Source Sans Pro"/>
+          <w:color w:val="000000"/>
+          <w:sz w:val="19"/>
+          <w:szCs w:val="19"/>
+        </w:rPr>
+        <w:t>Documented findings and corrective actions to support remediation tracking and review evidence.</w:t>
+      </w:r>
+      <w:r>
+        <w:rPr>
+          <w:rFonts w:ascii="Source Sans Pro" w:eastAsia="Source Sans Pro" w:hAnsi="Source Sans Pro" w:cs="Source Sans Pro"/>
+          <w:color w:val="000000"/>
+          <w:sz w:val="19"/>
+          <w:szCs w:val="19"/>
+        </w:rPr>
+        <w:t/>
+      </w:r>
+      <w:r>
+        <w:rPr>
+          <w:rFonts w:ascii="Source Sans Pro" w:eastAsia="Source Sans Pro" w:hAnsi="Source Sans Pro" w:cs="Source Sans Pro"/>
+          <w:color w:val="000000"/>
+          <w:sz w:val="19"/>
+          <w:szCs w:val="19"/>
+        </w:rPr>
+        <w:t/>
       </w:r>
     </w:p>
     <w:p>
       <w:pPr>
         <w:pStyle w:val="ListParagraph"/>
-        <w:spacing w:before="20" w:after="20"/>
+        <w:spacing w:before="32" w:after="32"/>
         <w:ind w:left="450"/>
       </w:pPr>
     </w:p>
     <w:p>
       <w:pPr>
         <w:pStyle w:val="ListParagraph"/>
-        <w:spacing w:before="20" w:after="20"/>
+        <w:spacing w:before="32" w:after="32"/>
         <w:ind w:left="450"/>
       </w:pPr>
     </w:p>
@@ -510,7 +510,7 @@
         <w:pBdr>
           <w:bottom w:val="single" w:sz="6" w:space="1" w:color="000000"/>
         </w:pBdr>
-        <w:spacing w:before="116" w:after="0"/>
+        <w:spacing w:before="173" w:after="0"/>
       </w:pPr>
       <w:r>
         <w:rPr>
@@ -577,16 +577,16 @@
           <w:ilvl w:val="0"/>
           <w:numId w:val="2"/>
         </w:numPr>
-        <w:spacing w:before="13" w:after="33"/>
-      </w:pPr>
-      <w:r>
-        <w:rPr>
-          <w:rFonts w:ascii="Source Sans Pro" w:eastAsia="Source Sans Pro" w:hAnsi="Source Sans Pro" w:cs="Source Sans Pro"/>
-          <w:color w:val="000000"/>
-          <w:sz w:val="19"/>
-          <w:szCs w:val="19"/>
-        </w:rPr>
-        <w:t>Developed automated vulnerability assessment pipeline using Nessus and OpenVAS REST APIs in Python, generating CVE reports with CVSS severity classification and EPSS scoring from FIRST.org API.</w:t>
+        <w:spacing w:before="13" w:after="48"/>
+      </w:pPr>
+      <w:r>
+        <w:rPr>
+          <w:rFonts w:ascii="Source Sans Pro" w:eastAsia="Source Sans Pro" w:hAnsi="Source Sans Pro" w:cs="Source Sans Pro"/>
+          <w:color w:val="000000"/>
+          <w:sz w:val="19"/>
+          <w:szCs w:val="19"/>
+        </w:rPr>
+        <w:t>Developed automated vulnerability assessment pipeline in Python, integrating Nessus and OpenVAS APIs, generating CVE reports with CVSS severity classification and EPSS scoring from FIRST.org API.</w:t>
       </w:r>
     </w:p>
     <w:p>
@@ -596,7 +596,7 @@
           <w:ilvl w:val="0"/>
           <w:numId w:val="2"/>
         </w:numPr>
-        <w:spacing w:before="13" w:after="33"/>
+        <w:spacing w:before="13" w:after="48"/>
       </w:pPr>
       <w:r>
         <w:rPr>
@@ -615,21 +615,21 @@
           <w:ilvl w:val="0"/>
           <w:numId w:val="2"/>
         </w:numPr>
-        <w:spacing w:before="13" w:after="33"/>
-      </w:pPr>
-      <w:r>
-        <w:rPr>
-          <w:rFonts w:ascii="Source Sans Pro" w:eastAsia="Source Sans Pro" w:hAnsi="Source Sans Pro" w:cs="Source Sans Pro"/>
-          <w:color w:val="000000"/>
-          <w:sz w:val="19"/>
-          <w:szCs w:val="19"/>
-        </w:rPr>
-        <w:t>Automated scan scheduling via Bash and cron; built delta-scan logic for CVE flagging and remediation SLA deadlines (Critical=24hrs, High=7 days, Medium=30 days).</w:t>
-      </w:r>
-    </w:p>
-    <w:p>
-      <w:pPr>
-        <w:spacing w:before="20" w:after="20"/>
+        <w:spacing w:before="13" w:after="48"/>
+      </w:pPr>
+      <w:r>
+        <w:rPr>
+          <w:rFonts w:ascii="Source Sans Pro" w:eastAsia="Source Sans Pro" w:hAnsi="Source Sans Pro" w:cs="Source Sans Pro"/>
+          <w:color w:val="000000"/>
+          <w:sz w:val="19"/>
+          <w:szCs w:val="19"/>
+        </w:rPr>
+        <w:t>Automated scan scheduling via Bash and cron; built delta-scan logic to flag new CVEs and calculate remediation SLA deadlines (Critical=24hrs, High=7 days, Medium=30 days).</w:t>
+      </w:r>
+    </w:p>
+    <w:p>
+      <w:pPr>
+        <w:spacing w:before="32" w:after="32"/>
       </w:pPr>
     </w:p>
     <w:p>
@@ -685,16 +685,16 @@
           <w:ilvl w:val="0"/>
           <w:numId w:val="2"/>
         </w:numPr>
-        <w:spacing w:before="13" w:after="33"/>
-      </w:pPr>
-      <w:r>
-        <w:rPr>
-          <w:rFonts w:ascii="Source Sans Pro" w:eastAsia="Source Sans Pro" w:hAnsi="Source Sans Pro" w:cs="Source Sans Pro"/>
-          <w:color w:val="000000"/>
-          <w:sz w:val="19"/>
-          <w:szCs w:val="19"/>
-        </w:rPr>
-        <w:t>Deployed Splunk SIEM with SPL searches for brute-force detection, lateral movement, and privilege escalation (T1110, T1078, T1059); mapped TTPs and wrote incident report.</w:t>
+        <w:spacing w:before="13" w:after="48"/>
+      </w:pPr>
+      <w:r>
+        <w:rPr>
+          <w:rFonts w:ascii="Source Sans Pro" w:eastAsia="Source Sans Pro" w:hAnsi="Source Sans Pro" w:cs="Source Sans Pro"/>
+          <w:color w:val="000000"/>
+          <w:sz w:val="19"/>
+          <w:szCs w:val="19"/>
+        </w:rPr>
+        <w:t>Deployed Splunk SIEM with SPL searches for brute-force detection, lateral movement, and privilege escalation (T1110, T1078, T1059); mapped TTPs and wrote PICERL incident report.</w:t>
       </w:r>
     </w:p>
     <w:p>
@@ -704,16 +704,16 @@
           <w:ilvl w:val="0"/>
           <w:numId w:val="2"/>
         </w:numPr>
-        <w:spacing w:before="13" w:after="33"/>
-      </w:pPr>
-      <w:r>
-        <w:rPr>
-          <w:rFonts w:ascii="Source Sans Pro" w:eastAsia="Source Sans Pro" w:hAnsi="Source Sans Pro" w:cs="Source Sans Pro"/>
-          <w:color w:val="000000"/>
-          <w:sz w:val="19"/>
-          <w:szCs w:val="19"/>
-        </w:rPr>
-        <w:t>Developed SOAR-style detection pipeline: Python script ingests Splunk alerts, enriches with VirusTotal API, and dispatches Telegram notifications with severity classification (EPSS 8.5).</w:t>
+        <w:spacing w:before="45" w:after="45"/>
+      </w:pPr>
+      <w:r>
+        <w:rPr>
+          <w:rFonts w:ascii="Source Sans Pro" w:eastAsia="Source Sans Pro" w:hAnsi="Source Sans Pro" w:cs="Source Sans Pro"/>
+          <w:color w:val="000000"/>
+          <w:sz w:val="19"/>
+          <w:szCs w:val="19"/>
+        </w:rPr>
+        <w:t>Developed SOAR-style pipeline: Python script ingests Splunk alerts, enriches with VirusTotal API, and dispatches Telegram notifications with severity classification, reducing mean time to triage by 50% (EPSS 8.5).</w:t>
       </w:r>
     </w:p>
     <w:p>
@@ -723,22 +723,22 @@
           <w:ilvl w:val="0"/>
           <w:numId w:val="2"/>
         </w:numPr>
-        <w:spacing w:before="13" w:after="33"/>
-      </w:pPr>
-      <w:r>
-        <w:rPr>
-          <w:rFonts w:ascii="Source Sans Pro" w:eastAsia="Source Sans Pro" w:hAnsi="Source Sans Pro" w:cs="Source Sans Pro"/>
-          <w:color w:val="000000"/>
-          <w:sz w:val="19"/>
-          <w:szCs w:val="19"/>
-        </w:rPr>
-        <w:t>Converted detection logic to Sigma rules; analyzed TCP/IP traffic in Wireshark for SYN scans, DNS tunnelling, and plaintext credential exposure.</w:t>
+        <w:spacing w:before="13" w:after="48"/>
+      </w:pPr>
+      <w:r>
+        <w:rPr>
+          <w:rFonts w:ascii="Source Sans Pro" w:eastAsia="Source Sans Pro" w:hAnsi="Source Sans Pro" w:cs="Source Sans Pro"/>
+          <w:color w:val="000000"/>
+          <w:sz w:val="19"/>
+          <w:szCs w:val="19"/>
+        </w:rPr>
+        <w:t>Converted detection logic to Sigma rules (detection-as-code) for enterprise SOCs; analyzed TCP/IP in Wireshark for SYN scans, DNS tunnelling, and plaintext credential exposure.</w:t>
       </w:r>
     </w:p>
     <w:p>
       <w:pPr>
         <w:pStyle w:val="ListParagraph"/>
-        <w:spacing w:before="20" w:after="20"/>
+        <w:spacing w:before="32" w:after="32"/>
         <w:ind w:left="450"/>
       </w:pPr>
     </w:p>
@@ -747,7 +747,7 @@
         <w:pBdr>
           <w:bottom w:val="single" w:sz="6" w:space="1" w:color="000000"/>
         </w:pBdr>
-        <w:spacing w:before="116" w:after="0"/>
+        <w:spacing w:before="173" w:after="0"/>
       </w:pPr>
       <w:r>
         <w:rPr>
@@ -763,7 +763,7 @@
     </w:p>
     <w:p>
       <w:pPr>
-        <w:spacing w:before="48" w:after="48"/>
+        <w:spacing w:before="56" w:after="56"/>
       </w:pPr>
       <w:r>
         <w:rPr>
@@ -785,7 +785,7 @@
     </w:p>
     <w:p>
       <w:pPr>
-        <w:spacing w:before="48" w:after="48"/>
+        <w:spacing w:before="56" w:after="56"/>
       </w:pPr>
       <w:r>
         <w:rPr>
@@ -807,7 +807,7 @@
     </w:p>
     <w:p>
       <w:pPr>
-        <w:spacing w:before="48" w:after="48"/>
+        <w:spacing w:before="56" w:after="56"/>
       </w:pPr>
       <w:r>
         <w:rPr>
@@ -829,7 +829,7 @@
     </w:p>
     <w:p>
       <w:pPr>
-        <w:spacing w:before="48" w:after="48"/>
+        <w:spacing w:before="56" w:after="56"/>
       </w:pPr>
       <w:r>
         <w:rPr>
@@ -851,7 +851,7 @@
     </w:p>
     <w:p>
       <w:pPr>
-        <w:spacing w:before="48" w:after="48"/>
+        <w:spacing w:before="56" w:after="56"/>
       </w:pPr>
       <w:r>
         <w:rPr>
@@ -868,7 +868,7 @@
           <w:sz w:val="19"/>
           <w:szCs w:val="19"/>
         </w:rPr>
-        <w:t>Python, Bash (basic), regular expressions, Compliance, Security Patch Management, Assess</w:t>
+        <w:t>Python, Bash (basic), regular expressions, Compliance, Nessus</w:t>
       </w:r>
     </w:p>
     <w:p>
@@ -876,7 +876,7 @@
         <w:pBdr>
           <w:bottom w:val="single" w:sz="6" w:space="1" w:color="000000"/>
         </w:pBdr>
-        <w:spacing w:before="20" w:after="20"/>
+        <w:spacing w:before="32" w:after="32"/>
         <w:rPr>
           <w:rFonts w:ascii="Source Sans Pro" w:eastAsia="Source Sans Pro" w:hAnsi="Source Sans Pro" w:cs="Source Sans Pro"/>
           <w:b/>
@@ -892,7 +892,7 @@
         <w:pBdr>
           <w:bottom w:val="single" w:sz="6" w:space="1" w:color="000000"/>
         </w:pBdr>
-        <w:spacing w:before="116" w:after="0"/>
+        <w:spacing w:before="173" w:after="0"/>
       </w:pPr>
       <w:r>
         <w:rPr>
@@ -913,7 +913,7 @@
           <w:ilvl w:val="0"/>
           <w:numId w:val="2"/>
         </w:numPr>
-        <w:spacing w:before="13" w:after="33"/>
+        <w:spacing w:before="13" w:after="48"/>
       </w:pPr>
       <w:r>
         <w:rPr>
@@ -932,7 +932,7 @@
           <w:ilvl w:val="0"/>
           <w:numId w:val="2"/>
         </w:numPr>
-        <w:spacing w:before="13" w:after="33"/>
+        <w:spacing w:before="13" w:after="48"/>
       </w:pPr>
       <w:r>
         <w:rPr>

</xml_diff>